<commit_message>
docs: update team member names in SRS, manual, and PPT
</commit_message>
<xml_diff>
--- a/T11-需求说明书-V4.0.docx
+++ b/T11-需求说明书-V4.0.docx
@@ -123,7 +123,7 @@
           <w:rFonts w:ascii="宋体" w:hAnsi="宋体" w:eastAsia="宋体"/>
           <w:sz w:val="22"/>
         </w:rPr>
-        <w:t>编制人：尚浩然 · 中国社会科学院大学 MPAcc 二班</w:t>
+        <w:t>小组成员：尚浩然、李金阳 · 中国社会科学院大学 MPAcc 二班</w:t>
       </w:r>
     </w:p>
     <w:p>
@@ -267,7 +267,7 @@
                 <w:rFonts w:ascii="宋体" w:hAnsi="宋体" w:eastAsia="宋体"/>
                 <w:sz w:val="20"/>
               </w:rPr>
-              <w:t>尚浩然</w:t>
+              <w:t>尚浩然、李金阳</w:t>
             </w:r>
           </w:p>
         </w:tc>
@@ -325,7 +325,7 @@
                 <w:rFonts w:ascii="宋体" w:hAnsi="宋体" w:eastAsia="宋体"/>
                 <w:sz w:val="20"/>
               </w:rPr>
-              <w:t>尚浩然</w:t>
+              <w:t>尚浩然、李金阳</w:t>
             </w:r>
           </w:p>
         </w:tc>
@@ -383,7 +383,7 @@
                 <w:rFonts w:ascii="宋体" w:hAnsi="宋体" w:eastAsia="宋体"/>
                 <w:sz w:val="20"/>
               </w:rPr>
-              <w:t>尚浩然</w:t>
+              <w:t>尚浩然、李金阳</w:t>
             </w:r>
           </w:p>
         </w:tc>
@@ -441,7 +441,7 @@
                 <w:rFonts w:ascii="宋体" w:hAnsi="宋体" w:eastAsia="宋体"/>
                 <w:sz w:val="20"/>
               </w:rPr>
-              <w:t>尚浩然</w:t>
+              <w:t>尚浩然、李金阳</w:t>
             </w:r>
           </w:p>
         </w:tc>

</xml_diff>